<commit_message>
Mock-review fixes and probe data-efficiency experiment (E1)
- fix §4.3 snap-through claim: vectors stay probe-readable (retrain
  0.93–0.98); what collapses is the receiver-usable channel
- state the detector threshold explicitly (0.95; channels ≤0.93, text 1.0)
- absolute-vs-retention wording, 0.998 max for OLMo attach, per-checkpoint
  CI wording, mean-probe parenthetical, "three retried of six failed seeds"
- E1: probe retrained on 50/200/500/2,000 pairs (3 seeds) — Table M1

Co-Authored-By: Claude Code <noreply@anthropic.com>
</commit_message>
<xml_diff>
--- a/sprint/paper/submission.docx
+++ b/sprint/paper/submission.docx
@@ -436,7 +436,7 @@
                       <w:iCs w:val="1"/>
                       <w:rtl w:val="0"/>
                     </w:rPr>
-                    <w:t>Multi-agent LLM systems are overseen by reading what agents say, but models can also communicate through learned vectors that a text monitor never sees. We study such a carrier between small frozen LLMs: an adapter pools the sender's hidden states into 16 vectors that the receiver reads in place of a text message, on a key-value recall task the receiver cannot solve without the message. The channel answers 94–96% of questions, against 29–37% for 16 tokens of text. We then take the defender's side. Snapping each incoming vector to its nearest token embedding removes all 49 channels we trained, into three receiver models (at most 0.4% accuracy), and leaves text unchanged; noise and partial snapping fail for one of the three receivers. A monitor that sees only the vectors, given paired examples, recovers 80–88% of transmitted digits with a linear probe (chance 10%), while reading the nearest tokens gives only fragments. These defences face an adaptive attacker, so we train channels against them: a channel fine-tuned to evade the deployed probe makes it useless, but its vectors stay far from the vocabulary, where a detector with no paired data flags them; a channel fine-tuned to look like tokens must sit on the vocabulary, where snapping still removes it; and a channel trained through snapping itself collapses instead of surviving. The channel is also shared and scales: one latent space serves two models in all four directions, a third model joins by training only its own adapter, and at about 3× compression the channel keeps twice the accuracy of text on messages up to 395 tokens. Together the defences corner an adaptive attacker: whatever it evades, the remaining message is either off-manifold and detectable or on-vocabulary and canonicalisable.</w:t>
+                    <w:t>Multi-agent LLM systems are overseen by reading what agents say, but models can also communicate through learned vectors that a text monitor never sees. We study such a carrier between small frozen LLMs: an adapter pools the sender's hidden states into 16 vectors that the receiver reads in place of a text message, on a key-value recall task the receiver cannot solve without the message. The channel answers 94–96% of questions on average, against 29–37% for 16 tokens of text. We then take the defender's side. Snapping each incoming vector to its nearest token embedding removes all 49 channels we trained, into three receiver models (at most 0.4% accuracy), and leaves text unchanged; noise and partial snapping fail for one of the three receivers. A monitor that sees only the vectors, given paired examples, recovers 80–88% of transmitted digits with a linear probe (chance 10%), while reading the nearest tokens gives only fragments. These defences face an adaptive attacker, so we train channels against them: a channel fine-tuned to evade the deployed probe makes it useless, but its vectors stay far from the vocabulary, where a detector with no paired data flags them; a channel fine-tuned to look like tokens must sit on the vocabulary, where snapping still removes it; and a channel trained through snapping itself collapses instead of surviving. The channel is also shared and scales: one latent space serves two models in all four directions, a third model joins by training only its own adapter, and at about 3× compression the channel keeps twice the accuracy of text on messages up to 395 tokens. Together the defences corner an adaptive attacker: whatever it evades, the remaining message is either off-manifold and detectable or on-vocabulary and canonicalisable.</w:t>
                   </w:r>
                   <w:r>
                     <w:rPr>
@@ -882,7 +882,7 @@
           <w:rFonts w:ascii="Old Standard TT" w:cs="Old Standard TT" w:eastAsia="Old Standard TT" w:hAnsi="Old Standard TT"/>
           <w:rtl w:val="0"/>
         </w:rPr>
-        <w:t>Snap at λ = 1 is canonicalisation: whatever the sender emits, the receiver only ever sees real token embeddings, so the channel becomes a text channel that a text monitor can read.</w:t>
+        <w:t>Snap at λ = 1 is canonicalisation: whatever the sender emits, the receiver only ever sees real token embeddings — a token string the overseer can log, so what survives is the known problem of hiding information in text (Roger &amp; Greenblatt, 2023), not a channel a text monitor cannot see.</w:t>
       </w:r>
     </w:p>
     <w:p>
@@ -907,7 +907,7 @@
           <w:rFonts w:ascii="Old Standard TT" w:cs="Old Standard TT" w:eastAsia="Old Standard TT" w:hAnsi="Old Standard TT"/>
           <w:rtl w:val="0"/>
         </w:rPr>
-        <w:t>The monitor sees only message vectors, not the decoder or receiver. We give it a strong position: 2,000 training messages paired with their documents, from which it trains a probe to output the 16 value digits in document order (10-way each, chance 0.1). Probes are linear on the flattened message, linear on the mean of the 16 vectors (no position information), and an MLP with one hidden layer of 512; weight decay is chosen on 200 held-back training documents, and probes are scored on the heldout documents. As a control task (Hewitt &amp; Liang, 2019), the same linear probe is trained with labels shuffled across training documents.</w:t>
+        <w:t>The monitor sees only message vectors, not the decoder or receiver. We give it a strong position: 2,000 training messages paired with their documents, from which it trains a probe to output the 16 value digits in document order (10-way each, chance 0.1). Probes are linear on the flattened message, linear on the mean of the 16 vectors (which discards position), and an MLP with one hidden layer of 512; weight decay is chosen on 200 held-back training documents, and probes are scored on the heldout documents. As a control task (Hewitt &amp; Liang, 2019), the same linear probe is trained with labels shuffled across training documents.</w:t>
       </w:r>
     </w:p>
     <w:p>
@@ -1158,7 +1158,7 @@
           <w:rFonts w:ascii="Old Standard TT" w:cs="Old Standard TT" w:eastAsia="Old Standard TT" w:hAnsi="Old Standard TT"/>
           <w:rtl w:val="0"/>
         </w:rPr>
-        <w:t>• Full snapping (λ = 1) drops every channel to at most 0.004 (0 of 8,000 questions for the 10 pair-only checkpoints) and leaves text unchanged, since text is already made of token embeddings. No checkpoint kept any direction above text (0 of 16; one-sided 95% upper bound 17%, Appendix F).</w:t>
+        <w:t>• Full snapping (λ = 1) drops every channel to at most 0.004 (0 of 8,000 questions for the 10 pair-only checkpoints) and leaves text unchanged, since text is already made of token embeddings. No checkpoint kept any direction above text (0 of 16 checkpoints; 95% upper bound 17% per checkpoint, Appendix F).</w:t>
       </w:r>
     </w:p>
     <w:p>
@@ -1216,7 +1216,7 @@
           <w:rFonts w:ascii="Old Standard TT" w:cs="Old Standard TT" w:eastAsia="Old Standard TT" w:hAnsi="Old Standard TT"/>
           <w:rtl w:val="0"/>
         </w:rPr>
-        <w:t>Snapped to its nearest tokens, the message reads as fragments of the document ("Code · value · 1 · 5 · Code · ␣ · 6 ..."), not what the receiver uses. A linear probe on the flattened message recovers 0.875 of digits and 0.587 of full values for Qwen→Qwen, and 0.803 and 0.405 for Qwen→SmolLM2 (Figure A1, Appendix G). On the mean of the 16 vectors it gets 0.27 to 0.31 of digits and almost no full values, so the content is laid out by vector position. The MLP probe does worse (0.737 and 0.545), likely overfitting 7M first-layer weights with 2,000 examples. With shuffled labels the linear probe fits its training set but scores 0.092 to 0.109 on heldout documents, at chance, so the real probe reads message content rather than memorising.</w:t>
+        <w:t>Snapped to its nearest tokens, the message reads as fragments of the document ("Code · value · 1 · 5 · Code · ␣ · 6 ..."), not what the receiver uses. A linear probe on the flattened message recovers 0.875 of digits and 0.587 of full values for Qwen→Qwen, and 0.803 and 0.405 for Qwen→SmolLM2 (Figure A1, Appendix G). On the mean of the 16 vectors it gets 0.27 to 0.31 of digits and almost no full values, so the content is laid out by vector position. The MLP probe does worse (0.737 and 0.545), likely overfitting 7M first-layer weights with 2,000 examples. With shuffled labels the linear probe fits its training set but scores 0.092 to 0.109 on heldout documents, at chance, so the real probe reads message content rather than memorising. The readout needs the pairs, and scales with them: retraining the same probe on 50, 200, 500 and 2,000 paired examples gives 0.158–0.166, 0.312–0.323, 0.519–0.554 and 0.867–0.888 of digits (3 seeds; Table M1, Appendix G) — an overseer with a realistic budget of a few hundred pairs reads only about a third of the message.</w:t>
       </w:r>
     </w:p>
     <w:p>
@@ -1258,7 +1258,7 @@
           <w:rFonts w:ascii="Old Standard TT" w:cs="Old Standard TT" w:eastAsia="Old Standard TT" w:hAnsi="Old Standard TT"/>
           <w:rtl w:val="0"/>
         </w:rPr>
-        <w:t xml:space="preserve"> With the probe-evasion term at λ = 10, the frozen linear probe's digit accuracy falls to 0.104–0.116 across all 3 seeds — chance is 0.1 — while the channel keeps 0.94–0.98 of its accuracy (λ = 3 and λ = 1 end at 0.140 and 0.192). A probe retrained on 2,000 fresh pairs from the adapted channel reads 0.76–0.80 again — the monitor survives by being retrained. But the evasion does not need to move the vectors, and does not: mean cosine similarity to the nearest token stays at 0.70–0.72 in every evasion seed, against 1.0 for text, so the nearest-token detector — no paired data, no training — still flags every one of these messages.</w:t>
+        <w:t xml:space="preserve"> With the probe-evasion term at λ = 10, the frozen linear probe's digit accuracy falls to 0.104–0.116 across all 3 seeds — chance is 0.1 — while the channel keeps 0.94–0.98 absolute heldout accuracy (λ = 3 and λ = 1 end at probe 0.140 and 0.192). A probe retrained on 2,000 fresh pairs from the adapted channel reads 0.76–0.80 again — the monitor survives by being retrained. But the evasion does not need to move the vectors, and does not: mean cosine similarity to the nearest token stays at 0.70–0.72 in every evasion seed, against 1.0 for text. A threshold at 0.95 separates the two perfectly in our data: every channel message we measured is at or below 0.93, text is 1.0, and the test needs no paired data and no training.</w:t>
       </w:r>
     </w:p>
     <w:p>
@@ -1292,7 +1292,7 @@
           <w:rFonts w:ascii="Old Standard TT" w:cs="Old Standard TT" w:eastAsia="Old Standard TT" w:hAnsi="Old Standard TT"/>
           <w:rtl w:val="0"/>
         </w:rPr>
-        <w:t xml:space="preserve"> A channel fine-tuned with the deployed snap itself in the loop — task loss computed on the hard-snapped message, gradients passed through the snap as identity — reaches 0.000 heldout accuracy in all 3 seeds with the countermeasure removed, its messages at cosine 0.14–0.17 and no probe-readable content left. The attacker finds no channel that survives canonicalisation; the optimisation collapses instead. This bounds this training setup, not the attacker in general.</w:t>
+        <w:t xml:space="preserve"> A channel fine-tuned with the deployed snap itself in the loop — task loss computed on the hard-snapped message, gradients passed through the snap as identity — reaches 0.000 heldout accuracy in all 3 seeds with the countermeasure removed. The vectors still encode the document (a probe retrained on them reads 0.93–0.98 of digits) but sit far from the vocabulary (cosine 0.14–0.17), where the paired-data-free detector flags them; what collapses is the receiver-usable channel. The optimisation never finds a channel that survives canonicalisation — a bound on this training setup, not on the attacker in general.</w:t>
       </w:r>
     </w:p>
     <w:p>
@@ -1317,7 +1317,7 @@
           <w:rFonts w:ascii="Old Standard TT" w:cs="Old Standard TT" w:eastAsia="Old Standard TT" w:hAnsi="Old Standard TT"/>
           <w:rtl w:val="0"/>
         </w:rPr>
-        <w:t>Two preexisting experiments asked whether one space Z can serve several models. In the shared-space experiment, Qwen and SmolLM2 each get an encoder into and a decoder out of a single Z, trained on all four directions: with 6,000 steps per direction, all 3 seeds pass 0.75 in every direction (0.806 to 0.962; Appendix D). In the third-model experiment, OLMo-2-1B attaches to the frozen Z by training only its own encoder and decoder, reaching 0.910 to 0.993 in all directions and seeds (39 shared-channel directions in Figure 2).</w:t>
+        <w:t>Two preexisting experiments asked whether one space Z can serve several models. In the shared-space experiment, Qwen and SmolLM2 each get an encoder into and a decoder out of a single Z, trained on all four directions: with 6,000 steps per direction, all 3 seeds pass 0.75 in every direction (0.806 to 0.962; Appendix D). In the third-model experiment, OLMo-2-1B attaches to the frozen Z by training only its own encoder and decoder, reaching 0.910 to 0.998 in all directions and seeds (39 shared-channel directions in Figure 2).</w:t>
       </w:r>
     </w:p>
     <w:p>
@@ -1351,7 +1351,7 @@
           <w:rFonts w:ascii="Old Standard TT" w:cs="Old Standard TT" w:eastAsia="Old Standard TT" w:hAnsi="Old Standard TT"/>
           <w:rtl w:val="0"/>
         </w:rPr>
-        <w:t>At 3.1× compression the channel reaches 0.818 to 0.975 at every length, against 0.401 to 0.461 for text, so the vectors needed grow with the message and the advantage stays about twofold. At 6.2× the recipe breaks from 8 pairs on: 6 of 7 runs end at 0.001 or below. The outcome is set early (step-500 accuracy predicts it, AUROC 0.986, Appendix F), and a curriculum starting with four times as many vectors and halving twice rescued all three failed seeds above text (0.300 to 0.513 against 0.200 to 0.205; Appendix E).</w:t>
+        <w:t>At 3.1× compression the channel reaches 0.818 to 0.975 at every length, against 0.401 to 0.461 for text, so the vectors needed grow with the message and the advantage stays about twofold. At 6.2× the recipe breaks from 8 pairs on: 6 of 7 runs end at 0.001 or below. The outcome is set early (step-500 accuracy predicts it, AUROC 0.986, Appendix F), and a curriculum starting with four times as many vectors and halving twice rescued the three retried failed seeds above text (0.300 to 0.513 against 0.200 to 0.205; three other failed seeds were not retried; Appendix E).</w:t>
       </w:r>
     </w:p>
     <w:p>
@@ -2544,6 +2544,62 @@
                 <w:sz w:val="16"/>
               </w:rPr>
               <w:t>E1a checkpoints fine-tuned under evasion objectives (probe-evade λ = 10, 1, 3; token-mimic λ = 1, 3; snap-through with a straight-through estimator), 1,500 steps each, 1–3 seeds, on the Mac (MPS, $0)</w:t>
+            </w:r>
+          </w:p>
+        </w:tc>
+      </w:tr>
+      <w:tr>
+        <w:tc>
+          <w:tcPr>
+            <w:tcW w:type="dxa" w:w="3118"/>
+          </w:tcPr>
+          <w:p>
+            <w:pPr>
+              <w:spacing w:after="0"/>
+            </w:pPr>
+            <w:r>
+              <w:rPr>
+                <w:rFonts w:ascii="Old Standard TT" w:cs="Old Standard TT" w:eastAsia="Old Standard TT" w:hAnsi="Old Standard TT"/>
+                <w:rtl w:val="0"/>
+                <w:sz w:val="16"/>
+              </w:rPr>
+              <w:t>Probe data efficiency</w:t>
+            </w:r>
+          </w:p>
+        </w:tc>
+        <w:tc>
+          <w:tcPr>
+            <w:tcW w:type="dxa" w:w="3118"/>
+          </w:tcPr>
+          <w:p>
+            <w:pPr>
+              <w:spacing w:after="0"/>
+            </w:pPr>
+            <w:r>
+              <w:rPr>
+                <w:rFonts w:ascii="Courier New" w:cs="Old Standard TT" w:eastAsia="Old Standard TT" w:hAnsi="Courier New"/>
+                <w:rtl w:val="0"/>
+                <w:sz w:val="16"/>
+              </w:rPr>
+              <w:t>e1_probe_eff.py</w:t>
+            </w:r>
+          </w:p>
+        </w:tc>
+        <w:tc>
+          <w:tcPr>
+            <w:tcW w:type="dxa" w:w="3118"/>
+          </w:tcPr>
+          <w:p>
+            <w:pPr>
+              <w:spacing w:after="0"/>
+            </w:pPr>
+            <w:r>
+              <w:rPr>
+                <w:rFonts w:ascii="Old Standard TT" w:cs="Old Standard TT" w:eastAsia="Old Standard TT" w:hAnsi="Old Standard TT"/>
+                <w:rtl w:val="0"/>
+                <w:sz w:val="16"/>
+              </w:rPr>
+              <w:t>The Figure A1 linear probe retrained on 50/200/500/2,000 paired examples, 3 E1a seeds, on the Mac (MPS, $0)</w:t>
             </w:r>
           </w:p>
         </w:tc>
@@ -15853,6 +15909,257 @@
                 <w:sz w:val="16"/>
               </w:rPr>
               <w:t>0.138–0.170</w:t>
+            </w:r>
+          </w:p>
+        </w:tc>
+      </w:tr>
+    </w:tbl>
+    <w:p>
+      <w:pPr>
+        <w:spacing w:after="40"/>
+      </w:pPr>
+    </w:p>
+    <w:p>
+      <w:r>
+        <w:rPr>
+          <w:rFonts w:ascii="Old Standard TT" w:cs="Old Standard TT" w:eastAsia="Old Standard TT" w:hAnsi="Old Standard TT"/>
+          <w:rtl w:val="0"/>
+          <w:b/>
+          <w:sz w:val="18"/>
+        </w:rPr>
+        <w:t>Table M1.</w:t>
+      </w:r>
+      <w:r>
+        <w:rPr>
+          <w:rFonts w:ascii="Old Standard TT" w:cs="Old Standard TT" w:eastAsia="Old Standard TT" w:hAnsi="Old Standard TT"/>
+          <w:rtl w:val="0"/>
+          <w:sz w:val="18"/>
+        </w:rPr>
+        <w:t xml:space="preserve"> Probe data efficiency (</w:t>
+      </w:r>
+      <w:r>
+        <w:rPr>
+          <w:rFonts w:ascii="Courier New" w:cs="Old Standard TT" w:eastAsia="Old Standard TT" w:hAnsi="Courier New"/>
+          <w:rtl w:val="0"/>
+          <w:sz w:val="18"/>
+        </w:rPr>
+        <w:t>sprint/e1_probe_eff.py</w:t>
+      </w:r>
+      <w:r>
+        <w:rPr>
+          <w:rFonts w:ascii="Old Standard TT" w:cs="Old Standard TT" w:eastAsia="Old Standard TT" w:hAnsi="Old Standard TT"/>
+          <w:rtl w:val="0"/>
+          <w:sz w:val="18"/>
+        </w:rPr>
+        <w:t>): the same linear probe as Figure A1, retrained on the first n paired training documents (standardisation statistics and weight decay also fit within those n only), scored on the 200 heldout documents. Ranges over 3 E1a seeds.</w:t>
+      </w:r>
+    </w:p>
+    <w:tbl>
+      <w:tblPr>
+        <w:tblLook w:firstColumn="1" w:firstRow="1" w:lastColumn="0" w:lastRow="0" w:noHBand="0" w:noVBand="1" w:val="04A0"/>
+        <w:tblBorders>
+          <w:top w:val="single" w:sz="4" w:color="999999"/>
+          <w:left w:val="single" w:sz="4" w:color="999999"/>
+          <w:bottom w:val="single" w:sz="4" w:color="999999"/>
+          <w:right w:val="single" w:sz="4" w:color="999999"/>
+          <w:insideH w:val="single" w:sz="4" w:color="999999"/>
+          <w:insideV w:val="single" w:sz="4" w:color="999999"/>
+        </w:tblBorders>
+        <w:tblW w:w="9355" w:type="dxa"/>
+        <w:tblLayout w:type="fixed"/>
+      </w:tblPr>
+      <w:tblGrid>
+        <w:gridCol w:w="2407"/>
+        <w:gridCol w:w="1737"/>
+        <w:gridCol w:w="1737"/>
+        <w:gridCol w:w="1737"/>
+        <w:gridCol w:w="1737"/>
+      </w:tblGrid>
+      <w:tr>
+        <w:tc>
+          <w:tcPr>
+            <w:tcW w:type="dxa" w:w="2407"/>
+          </w:tcPr>
+          <w:p>
+            <w:pPr>
+              <w:spacing w:after="0"/>
+            </w:pPr>
+            <w:r>
+              <w:rPr>
+                <w:rFonts w:ascii="Old Standard TT" w:cs="Old Standard TT" w:eastAsia="Old Standard TT" w:hAnsi="Old Standard TT"/>
+                <w:rtl w:val="0"/>
+                <w:b/>
+                <w:sz w:val="16"/>
+              </w:rPr>
+              <w:t>Paired examples n</w:t>
+            </w:r>
+          </w:p>
+        </w:tc>
+        <w:tc>
+          <w:tcPr>
+            <w:tcW w:type="dxa" w:w="1737"/>
+          </w:tcPr>
+          <w:p>
+            <w:pPr>
+              <w:spacing w:after="0"/>
+            </w:pPr>
+            <w:r>
+              <w:rPr>
+                <w:rFonts w:ascii="Old Standard TT" w:cs="Old Standard TT" w:eastAsia="Old Standard TT" w:hAnsi="Old Standard TT"/>
+                <w:rtl w:val="0"/>
+                <w:b/>
+                <w:sz w:val="16"/>
+              </w:rPr>
+              <w:t>50</w:t>
+            </w:r>
+          </w:p>
+        </w:tc>
+        <w:tc>
+          <w:tcPr>
+            <w:tcW w:type="dxa" w:w="1737"/>
+          </w:tcPr>
+          <w:p>
+            <w:pPr>
+              <w:spacing w:after="0"/>
+            </w:pPr>
+            <w:r>
+              <w:rPr>
+                <w:rFonts w:ascii="Old Standard TT" w:cs="Old Standard TT" w:eastAsia="Old Standard TT" w:hAnsi="Old Standard TT"/>
+                <w:rtl w:val="0"/>
+                <w:b/>
+                <w:sz w:val="16"/>
+              </w:rPr>
+              <w:t>200</w:t>
+            </w:r>
+          </w:p>
+        </w:tc>
+        <w:tc>
+          <w:tcPr>
+            <w:tcW w:type="dxa" w:w="1737"/>
+          </w:tcPr>
+          <w:p>
+            <w:pPr>
+              <w:spacing w:after="0"/>
+            </w:pPr>
+            <w:r>
+              <w:rPr>
+                <w:rFonts w:ascii="Old Standard TT" w:cs="Old Standard TT" w:eastAsia="Old Standard TT" w:hAnsi="Old Standard TT"/>
+                <w:rtl w:val="0"/>
+                <w:b/>
+                <w:sz w:val="16"/>
+              </w:rPr>
+              <w:t>500</w:t>
+            </w:r>
+          </w:p>
+        </w:tc>
+        <w:tc>
+          <w:tcPr>
+            <w:tcW w:type="dxa" w:w="1737"/>
+          </w:tcPr>
+          <w:p>
+            <w:pPr>
+              <w:spacing w:after="0"/>
+            </w:pPr>
+            <w:r>
+              <w:rPr>
+                <w:rFonts w:ascii="Old Standard TT" w:cs="Old Standard TT" w:eastAsia="Old Standard TT" w:hAnsi="Old Standard TT"/>
+                <w:rtl w:val="0"/>
+                <w:b/>
+                <w:sz w:val="16"/>
+              </w:rPr>
+              <w:t>2,000</w:t>
+            </w:r>
+          </w:p>
+        </w:tc>
+      </w:tr>
+      <w:tr>
+        <w:tc>
+          <w:tcPr>
+            <w:tcW w:type="dxa" w:w="2407"/>
+          </w:tcPr>
+          <w:p>
+            <w:pPr>
+              <w:spacing w:after="0"/>
+            </w:pPr>
+            <w:r>
+              <w:rPr>
+                <w:rFonts w:ascii="Old Standard TT" w:cs="Old Standard TT" w:eastAsia="Old Standard TT" w:hAnsi="Old Standard TT"/>
+                <w:rtl w:val="0"/>
+                <w:sz w:val="16"/>
+              </w:rPr>
+              <w:t>Digit accuracy</w:t>
+            </w:r>
+          </w:p>
+        </w:tc>
+        <w:tc>
+          <w:tcPr>
+            <w:tcW w:type="dxa" w:w="1737"/>
+          </w:tcPr>
+          <w:p>
+            <w:pPr>
+              <w:spacing w:after="0"/>
+            </w:pPr>
+            <w:r>
+              <w:rPr>
+                <w:rFonts w:ascii="Old Standard TT" w:cs="Old Standard TT" w:eastAsia="Old Standard TT" w:hAnsi="Old Standard TT"/>
+                <w:rtl w:val="0"/>
+                <w:sz w:val="16"/>
+              </w:rPr>
+              <w:t>0.158–0.166</w:t>
+            </w:r>
+          </w:p>
+        </w:tc>
+        <w:tc>
+          <w:tcPr>
+            <w:tcW w:type="dxa" w:w="1737"/>
+          </w:tcPr>
+          <w:p>
+            <w:pPr>
+              <w:spacing w:after="0"/>
+            </w:pPr>
+            <w:r>
+              <w:rPr>
+                <w:rFonts w:ascii="Old Standard TT" w:cs="Old Standard TT" w:eastAsia="Old Standard TT" w:hAnsi="Old Standard TT"/>
+                <w:rtl w:val="0"/>
+                <w:sz w:val="16"/>
+              </w:rPr>
+              <w:t>0.312–0.323</w:t>
+            </w:r>
+          </w:p>
+        </w:tc>
+        <w:tc>
+          <w:tcPr>
+            <w:tcW w:type="dxa" w:w="1737"/>
+          </w:tcPr>
+          <w:p>
+            <w:pPr>
+              <w:spacing w:after="0"/>
+            </w:pPr>
+            <w:r>
+              <w:rPr>
+                <w:rFonts w:ascii="Old Standard TT" w:cs="Old Standard TT" w:eastAsia="Old Standard TT" w:hAnsi="Old Standard TT"/>
+                <w:rtl w:val="0"/>
+                <w:sz w:val="16"/>
+              </w:rPr>
+              <w:t>0.519–0.554</w:t>
+            </w:r>
+          </w:p>
+        </w:tc>
+        <w:tc>
+          <w:tcPr>
+            <w:tcW w:type="dxa" w:w="1737"/>
+          </w:tcPr>
+          <w:p>
+            <w:pPr>
+              <w:spacing w:after="0"/>
+            </w:pPr>
+            <w:r>
+              <w:rPr>
+                <w:rFonts w:ascii="Old Standard TT" w:cs="Old Standard TT" w:eastAsia="Old Standard TT" w:hAnsi="Old Standard TT"/>
+                <w:rtl w:val="0"/>
+                <w:sz w:val="16"/>
+              </w:rPr>
+              <w:t>0.867–0.888</w:t>
             </w:r>
           </w:p>
         </w:tc>

</xml_diff>

<commit_message>
Move the cornering summary into the body (Table AD2) and tighten the abstract
- §4.3: dense prose ranges replaced by a 3-row cornering table + shorter
  mechanism paragraphs; detector threshold and retrained-probe caveats kept
- abstract: shorter, cornering result foregrounded
- Table AD1 caption tightened, points at AD2

Co-Authored-By: Claude Code <noreply@anthropic.com>
</commit_message>
<xml_diff>
--- a/sprint/paper/submission.docx
+++ b/sprint/paper/submission.docx
@@ -436,7 +436,7 @@
                       <w:iCs w:val="1"/>
                       <w:rtl w:val="0"/>
                     </w:rPr>
-                    <w:t>Multi-agent LLM systems are overseen by reading what agents say, but models can also communicate through learned vectors that a text monitor never sees. We study such a carrier between small frozen LLMs: an adapter pools the sender's hidden states into 16 vectors that the receiver reads in place of a text message, on a key-value recall task the receiver cannot solve without the message. The channel answers 94–96% of questions on average, against 29–37% for 16 tokens of text. We then take the defender's side. Snapping each incoming vector to its nearest token embedding removes all 49 channels we trained, into three receiver models (at most 0.4% accuracy), and leaves text unchanged; noise and partial snapping fail for one of the three receivers. A monitor that sees only the vectors, given paired examples, recovers 80–88% of transmitted digits with a linear probe (chance 10%), while reading the nearest tokens gives only fragments. These defences face an adaptive attacker, so we train channels against them: a channel fine-tuned to evade the deployed probe makes it useless, but its vectors stay far from the vocabulary, where a detector with no paired data flags them; a channel fine-tuned to look like tokens must sit on the vocabulary, where snapping still removes it; and a channel trained through snapping itself collapses instead of surviving. The channel is also shared and scales: one latent space serves two models in all four directions, a third model joins by training only its own adapter, and at about 3× compression the channel keeps twice the accuracy of text on messages up to 395 tokens. Together the defences corner an adaptive attacker: whatever it evades, the remaining message is either off-manifold and detectable or on-vocabulary and canonicalisable.</w:t>
+                    <w:t>Multi-agent LLM systems are overseen by reading what agents say, but models can also communicate through learned vectors that a text monitor never sees. We study such a carrier between small frozen LLMs: an adapter pools the sender's hidden states into 16 vectors that the receiver reads in place of a text message, answering 94–96% of questions on a recall task against 29–37% for 16 tokens of text. We then take the defender's side. Snapping each incoming vector to its nearest token embedding removes all 49 channels we trained, into three receiver models, and leaves text unchanged; a monitor given 2,000 paired examples recovers 80–88% of transmitted digits with a linear probe (chance 10%). Because these defences face an adaptive attacker, we train channels against them — and each evasion walks into another defence: a channel fine-tuned to evade the deployed probe succeeds, but its vectors stay far from the vocabulary, where a paired-data-free detector flags them; a channel fine-tuned to look like tokens must sit on the vocabulary, where snapping still removes it; and a channel trained through snapping itself collapses. The channel is also shared across models and holds about twice the accuracy of text up to 395-token messages. Together the defences corner an adaptive attacker: whatever it evades, the remaining message is either off-manifold and detectable or on-vocabulary and canonicalisable.</w:t>
                   </w:r>
                   <w:r>
                     <w:rPr>
@@ -1241,7 +1241,7 @@
           <w:rFonts w:ascii="Old Standard TT" w:cs="Old Standard TT" w:eastAsia="Old Standard TT" w:hAnsi="Old Standard TT"/>
           <w:rtl w:val="0"/>
         </w:rPr>
-        <w:t>Each evasion beats the defence it targets, and each then fails against a defence it did not target (Table AD1, Appendix G).</w:t>
+        <w:t>Each evasion beats the defence it targets, and each then fails against a defence it did not target. Table AD2 shows the corner; per-run detail is in Table AD1 (Appendix G).</w:t>
       </w:r>
     </w:p>
     <w:p>
@@ -1250,16 +1250,344 @@
           <w:rFonts w:ascii="Old Standard TT" w:cs="Old Standard TT" w:eastAsia="Old Standard TT" w:hAnsi="Old Standard TT"/>
           <w:rtl w:val="0"/>
           <w:b/>
-        </w:rPr>
-        <w:t>Evading the deployed monitor succeeds at no cost; the paired-data-free detector still sees the result.</w:t>
-      </w:r>
-      <w:r>
-        <w:rPr>
-          <w:rFonts w:ascii="Old Standard TT" w:cs="Old Standard TT" w:eastAsia="Old Standard TT" w:hAnsi="Old Standard TT"/>
-          <w:rtl w:val="0"/>
-        </w:rPr>
-        <w:t xml:space="preserve"> With the probe-evasion term at λ = 10, the frozen linear probe's digit accuracy falls to 0.104–0.116 across all 3 seeds — chance is 0.1 — while the channel keeps 0.94–0.98 absolute heldout accuracy (λ = 3 and λ = 1 end at probe 0.140 and 0.192). A probe retrained on 2,000 fresh pairs from the adapted channel reads 0.76–0.80 again — the monitor survives by being retrained. But the evasion does not need to move the vectors, and does not: mean cosine similarity to the nearest token stays at 0.70–0.72 in every evasion seed, against 1.0 for text. A threshold at 0.95 separates the two perfectly in our data: every channel message we measured is at or below 0.93, text is 1.0, and the test needs no paired data and no training.</w:t>
-      </w:r>
+          <w:sz w:val="18"/>
+        </w:rPr>
+        <w:t>Table AD2.</w:t>
+      </w:r>
+      <w:r>
+        <w:rPr>
+          <w:rFonts w:ascii="Old Standard TT" w:cs="Old Standard TT" w:eastAsia="Old Standard TT" w:hAnsi="Old Standard TT"/>
+          <w:rtl w:val="0"/>
+          <w:sz w:val="18"/>
+        </w:rPr>
+        <w:t xml:space="preserve"> Adaptive channels against the deployed defences (ranges over 3 seeds; lower λ and single-seed runs in Table AD1). "Probe": frozen deployed monitor's digit accuracy, chance 0.1; "cos": mean cosine to the nearest token embedding, text 1.0.</w:t>
+      </w:r>
+    </w:p>
+    <w:tbl>
+      <w:tblPr>
+        <w:tblLook w:firstColumn="1" w:firstRow="1" w:lastColumn="0" w:lastRow="0" w:noHBand="0" w:noVBand="1" w:val="04A0"/>
+        <w:tblBorders>
+          <w:top w:val="single" w:sz="4" w:color="999999"/>
+          <w:left w:val="single" w:sz="4" w:color="999999"/>
+          <w:bottom w:val="single" w:sz="4" w:color="999999"/>
+          <w:right w:val="single" w:sz="4" w:color="999999"/>
+          <w:insideH w:val="single" w:sz="4" w:color="999999"/>
+          <w:insideV w:val="single" w:sz="4" w:color="999999"/>
+        </w:tblBorders>
+        <w:tblW w:w="9354" w:type="dxa"/>
+        <w:tblLayout w:type="fixed"/>
+      </w:tblPr>
+      <w:tblGrid>
+        <w:gridCol w:w="2597"/>
+        <w:gridCol w:w="1449"/>
+        <w:gridCol w:w="3732"/>
+        <w:gridCol w:w="1576"/>
+      </w:tblGrid>
+      <w:tr>
+        <w:tc>
+          <w:tcPr>
+            <w:tcW w:type="dxa" w:w="2597"/>
+          </w:tcPr>
+          <w:p>
+            <w:pPr>
+              <w:spacing w:after="0"/>
+            </w:pPr>
+            <w:r>
+              <w:rPr>
+                <w:rFonts w:ascii="Old Standard TT" w:cs="Old Standard TT" w:eastAsia="Old Standard TT" w:hAnsi="Old Standard TT"/>
+                <w:rtl w:val="0"/>
+                <w:b/>
+                <w:sz w:val="16"/>
+              </w:rPr>
+              <w:t>Strategy (target)</w:t>
+            </w:r>
+          </w:p>
+        </w:tc>
+        <w:tc>
+          <w:tcPr>
+            <w:tcW w:type="dxa" w:w="1449"/>
+          </w:tcPr>
+          <w:p>
+            <w:pPr>
+              <w:spacing w:after="0"/>
+            </w:pPr>
+            <w:r>
+              <w:rPr>
+                <w:rFonts w:ascii="Old Standard TT" w:cs="Old Standard TT" w:eastAsia="Old Standard TT" w:hAnsi="Old Standard TT"/>
+                <w:rtl w:val="0"/>
+                <w:b/>
+                <w:sz w:val="16"/>
+              </w:rPr>
+              <w:t>Beats its target</w:t>
+            </w:r>
+          </w:p>
+        </w:tc>
+        <w:tc>
+          <w:tcPr>
+            <w:tcW w:type="dxa" w:w="3732"/>
+          </w:tcPr>
+          <w:p>
+            <w:pPr>
+              <w:spacing w:after="0"/>
+            </w:pPr>
+            <w:r>
+              <w:rPr>
+                <w:rFonts w:ascii="Old Standard TT" w:cs="Old Standard TT" w:eastAsia="Old Standard TT" w:hAnsi="Old Standard TT"/>
+                <w:rtl w:val="0"/>
+                <w:b/>
+                <w:sz w:val="16"/>
+              </w:rPr>
+              <w:t>Then caught by</w:t>
+            </w:r>
+          </w:p>
+        </w:tc>
+        <w:tc>
+          <w:tcPr>
+            <w:tcW w:type="dxa" w:w="1576"/>
+          </w:tcPr>
+          <w:p>
+            <w:pPr>
+              <w:spacing w:after="0"/>
+            </w:pPr>
+            <w:r>
+              <w:rPr>
+                <w:rFonts w:ascii="Old Standard TT" w:cs="Old Standard TT" w:eastAsia="Old Standard TT" w:hAnsi="Old Standard TT"/>
+                <w:rtl w:val="0"/>
+                <w:b/>
+                <w:sz w:val="16"/>
+              </w:rPr>
+              <w:t>Channel cost</w:t>
+            </w:r>
+          </w:p>
+        </w:tc>
+      </w:tr>
+      <w:tr>
+        <w:tc>
+          <w:tcPr>
+            <w:tcW w:type="dxa" w:w="2597"/>
+          </w:tcPr>
+          <w:p>
+            <w:pPr>
+              <w:spacing w:after="0"/>
+            </w:pPr>
+            <w:r>
+              <w:rPr>
+                <w:rFonts w:ascii="Old Standard TT" w:cs="Old Standard TT" w:eastAsia="Old Standard TT" w:hAnsi="Old Standard TT"/>
+                <w:rtl w:val="0"/>
+                <w:sz w:val="16"/>
+              </w:rPr>
+              <w:t>Evade probe, λ = 10 (monitor)</w:t>
+            </w:r>
+          </w:p>
+        </w:tc>
+        <w:tc>
+          <w:tcPr>
+            <w:tcW w:type="dxa" w:w="1449"/>
+          </w:tcPr>
+          <w:p>
+            <w:pPr>
+              <w:spacing w:after="0"/>
+            </w:pPr>
+            <w:r>
+              <w:rPr>
+                <w:rFonts w:ascii="Old Standard TT" w:cs="Old Standard TT" w:eastAsia="Old Standard TT" w:hAnsi="Old Standard TT"/>
+                <w:rtl w:val="0"/>
+                <w:sz w:val="16"/>
+              </w:rPr>
+              <w:t>probe → 0.10–0.12</w:t>
+            </w:r>
+          </w:p>
+        </w:tc>
+        <w:tc>
+          <w:tcPr>
+            <w:tcW w:type="dxa" w:w="3732"/>
+          </w:tcPr>
+          <w:p>
+            <w:pPr>
+              <w:spacing w:after="0"/>
+            </w:pPr>
+            <w:r>
+              <w:rPr>
+                <w:rFonts w:ascii="Old Standard TT" w:cs="Old Standard TT" w:eastAsia="Old Standard TT" w:hAnsi="Old Standard TT"/>
+                <w:rtl w:val="0"/>
+                <w:sz w:val="16"/>
+              </w:rPr>
+              <w:t>nearest-token detector: cos stays 0.70–0.72 (threshold 0.95)</w:t>
+            </w:r>
+          </w:p>
+        </w:tc>
+        <w:tc>
+          <w:tcPr>
+            <w:tcW w:type="dxa" w:w="1576"/>
+          </w:tcPr>
+          <w:p>
+            <w:pPr>
+              <w:spacing w:after="0"/>
+            </w:pPr>
+            <w:r>
+              <w:rPr>
+                <w:rFonts w:ascii="Old Standard TT" w:cs="Old Standard TT" w:eastAsia="Old Standard TT" w:hAnsi="Old Standard TT"/>
+                <w:rtl w:val="0"/>
+                <w:sz w:val="16"/>
+              </w:rPr>
+              <w:t>none: 0.94–0.98</w:t>
+            </w:r>
+          </w:p>
+        </w:tc>
+      </w:tr>
+      <w:tr>
+        <w:tc>
+          <w:tcPr>
+            <w:tcW w:type="dxa" w:w="2597"/>
+          </w:tcPr>
+          <w:p>
+            <w:pPr>
+              <w:spacing w:after="0"/>
+            </w:pPr>
+            <w:r>
+              <w:rPr>
+                <w:rFonts w:ascii="Old Standard TT" w:cs="Old Standard TT" w:eastAsia="Old Standard TT" w:hAnsi="Old Standard TT"/>
+                <w:rtl w:val="0"/>
+                <w:sz w:val="16"/>
+              </w:rPr>
+              <w:t>Mimic tokens, λ = 1 (detector)</w:t>
+            </w:r>
+          </w:p>
+        </w:tc>
+        <w:tc>
+          <w:tcPr>
+            <w:tcW w:type="dxa" w:w="1449"/>
+          </w:tcPr>
+          <w:p>
+            <w:pPr>
+              <w:spacing w:after="0"/>
+            </w:pPr>
+            <w:r>
+              <w:rPr>
+                <w:rFonts w:ascii="Old Standard TT" w:cs="Old Standard TT" w:eastAsia="Old Standard TT" w:hAnsi="Old Standard TT"/>
+                <w:rtl w:val="0"/>
+                <w:sz w:val="16"/>
+              </w:rPr>
+              <w:t>cos → 0.90–0.91</w:t>
+            </w:r>
+          </w:p>
+        </w:tc>
+        <w:tc>
+          <w:tcPr>
+            <w:tcW w:type="dxa" w:w="3732"/>
+          </w:tcPr>
+          <w:p>
+            <w:pPr>
+              <w:spacing w:after="0"/>
+            </w:pPr>
+            <w:r>
+              <w:rPr>
+                <w:rFonts w:ascii="Old Standard TT" w:cs="Old Standard TT" w:eastAsia="Old Standard TT" w:hAnsi="Old Standard TT"/>
+                <w:rtl w:val="0"/>
+                <w:sz w:val="16"/>
+              </w:rPr>
+              <w:t>full snap: 0.000</w:t>
+            </w:r>
+          </w:p>
+        </w:tc>
+        <w:tc>
+          <w:tcPr>
+            <w:tcW w:type="dxa" w:w="1576"/>
+          </w:tcPr>
+          <w:p>
+            <w:pPr>
+              <w:spacing w:after="0"/>
+            </w:pPr>
+            <w:r>
+              <w:rPr>
+                <w:rFonts w:ascii="Old Standard TT" w:cs="Old Standard TT" w:eastAsia="Old Standard TT" w:hAnsi="Old Standard TT"/>
+                <w:rtl w:val="0"/>
+                <w:sz w:val="16"/>
+              </w:rPr>
+              <w:t>~1 point: 0.96–0.98</w:t>
+            </w:r>
+          </w:p>
+        </w:tc>
+      </w:tr>
+      <w:tr>
+        <w:tc>
+          <w:tcPr>
+            <w:tcW w:type="dxa" w:w="2597"/>
+          </w:tcPr>
+          <w:p>
+            <w:pPr>
+              <w:spacing w:after="0"/>
+            </w:pPr>
+            <w:r>
+              <w:rPr>
+                <w:rFonts w:ascii="Old Standard TT" w:cs="Old Standard TT" w:eastAsia="Old Standard TT" w:hAnsi="Old Standard TT"/>
+                <w:rtl w:val="0"/>
+                <w:sz w:val="16"/>
+              </w:rPr>
+              <w:t>Train through snap (canonicalisation)</w:t>
+            </w:r>
+          </w:p>
+        </w:tc>
+        <w:tc>
+          <w:tcPr>
+            <w:tcW w:type="dxa" w:w="1449"/>
+          </w:tcPr>
+          <w:p>
+            <w:pPr>
+              <w:spacing w:after="0"/>
+            </w:pPr>
+            <w:r>
+              <w:rPr>
+                <w:rFonts w:ascii="Old Standard TT" w:cs="Old Standard TT" w:eastAsia="Old Standard TT" w:hAnsi="Old Standard TT"/>
+                <w:rtl w:val="0"/>
+                <w:sz w:val="16"/>
+              </w:rPr>
+              <w:t>—</w:t>
+            </w:r>
+          </w:p>
+        </w:tc>
+        <w:tc>
+          <w:tcPr>
+            <w:tcW w:type="dxa" w:w="3732"/>
+          </w:tcPr>
+          <w:p>
+            <w:pPr>
+              <w:spacing w:after="0"/>
+            </w:pPr>
+            <w:r>
+              <w:rPr>
+                <w:rFonts w:ascii="Old Standard TT" w:cs="Old Standard TT" w:eastAsia="Old Standard TT" w:hAnsi="Old Standard TT"/>
+                <w:rtl w:val="0"/>
+                <w:sz w:val="16"/>
+              </w:rPr>
+              <w:t>collapse: 0.000 in 3/3 with snap removed</w:t>
+            </w:r>
+          </w:p>
+        </w:tc>
+        <w:tc>
+          <w:tcPr>
+            <w:tcW w:type="dxa" w:w="1576"/>
+          </w:tcPr>
+          <w:p>
+            <w:pPr>
+              <w:spacing w:after="0"/>
+            </w:pPr>
+            <w:r>
+              <w:rPr>
+                <w:rFonts w:ascii="Old Standard TT" w:cs="Old Standard TT" w:eastAsia="Old Standard TT" w:hAnsi="Old Standard TT"/>
+                <w:rtl w:val="0"/>
+                <w:sz w:val="16"/>
+              </w:rPr>
+              <w:t>total</w:t>
+            </w:r>
+          </w:p>
+        </w:tc>
+      </w:tr>
+    </w:tbl>
+    <w:p>
+      <w:pPr>
+        <w:spacing w:after="40"/>
+      </w:pPr>
     </w:p>
     <w:p>
       <w:r>
@@ -1268,14 +1596,14 @@
           <w:rtl w:val="0"/>
           <w:b/>
         </w:rPr>
-        <w:t>Mimicking text fools the detector's distance, and walks into canonicalisation.</w:t>
-      </w:r>
-      <w:r>
-        <w:rPr>
-          <w:rFonts w:ascii="Old Standard TT" w:cs="Old Standard TT" w:eastAsia="Old Standard TT" w:hAnsi="Old Standard TT"/>
-          <w:rtl w:val="0"/>
-        </w:rPr>
-        <w:t xml:space="preserve"> With the mimic term at λ = 1, cosine similarity to the nearest token rises from 0.727–0.740 to 0.901–0.906 across 3 seeds at a channel cost of about a point (0.96–0.98; λ = 3 reaches 0.931 for 4 points, 0.933). But full snapping still drops every mimic run to 0.000 — pulled toward the vocabulary, the message is replaced by real tokens, and the token string the overseer then reads is not the encoding the receiver was trained on. The linear probe also still reads 0.60–0.67 of its digits.</w:t>
+        <w:t>Evading the monitor succeeds at no cost, and the evasion does not need to move the vectors — so it does not.</w:t>
+      </w:r>
+      <w:r>
+        <w:rPr>
+          <w:rFonts w:ascii="Old Standard TT" w:cs="Old Standard TT" w:eastAsia="Old Standard TT" w:hAnsi="Old Standard TT"/>
+          <w:rtl w:val="0"/>
+        </w:rPr>
+        <w:t xml:space="preserve"> A probe retrained on 2,000 fresh pairs from the adapted channel reads 0.76–0.80 again: the monitor survives by being retrained, but the nearest-token detector — a 0.95 threshold on cosine, no paired data, no training — still flags every evasive message (λ = 3 and λ = 1 end at probe 0.140 and 0.192).</w:t>
       </w:r>
     </w:p>
     <w:p>
@@ -1285,14 +1613,31 @@
           <w:rtl w:val="0"/>
           <w:b/>
         </w:rPr>
-        <w:t>Training through the snap collapses the channel.</w:t>
-      </w:r>
-      <w:r>
-        <w:rPr>
-          <w:rFonts w:ascii="Old Standard TT" w:cs="Old Standard TT" w:eastAsia="Old Standard TT" w:hAnsi="Old Standard TT"/>
-          <w:rtl w:val="0"/>
-        </w:rPr>
-        <w:t xml:space="preserve"> A channel fine-tuned with the deployed snap itself in the loop — task loss computed on the hard-snapped message, gradients passed through the snap as identity — reaches 0.000 heldout accuracy in all 3 seeds with the countermeasure removed. The vectors still encode the document (a probe retrained on them reads 0.93–0.98 of digits) but sit far from the vocabulary (cosine 0.14–0.17), where the paired-data-free detector flags them; what collapses is the receiver-usable channel. The optimisation never finds a channel that survives canonicalisation — a bound on this training setup, not on the attacker in general.</w:t>
+        <w:t>Mimicking tokens pulls the vectors onto the vocabulary, where the message is replaced by real tokens</w:t>
+      </w:r>
+      <w:r>
+        <w:rPr>
+          <w:rFonts w:ascii="Old Standard TT" w:cs="Old Standard TT" w:eastAsia="Old Standard TT" w:hAnsi="Old Standard TT"/>
+          <w:rtl w:val="0"/>
+        </w:rPr>
+        <w:t xml:space="preserve"> — a token string that is not the encoding the receiver was trained on, so full snapping drops every mimic run to 0.000; the probe also still reads 0.60–0.67 of its digits (λ = 3 reaches cos 0.931 for 4 points, 0.933).</w:t>
+      </w:r>
+    </w:p>
+    <w:p>
+      <w:r>
+        <w:rPr>
+          <w:rFonts w:ascii="Old Standard TT" w:cs="Old Standard TT" w:eastAsia="Old Standard TT" w:hAnsi="Old Standard TT"/>
+          <w:rtl w:val="0"/>
+          <w:b/>
+        </w:rPr>
+        <w:t>Training through the snap never finds a surviving channel.</w:t>
+      </w:r>
+      <w:r>
+        <w:rPr>
+          <w:rFonts w:ascii="Old Standard TT" w:cs="Old Standard TT" w:eastAsia="Old Standard TT" w:hAnsi="Old Standard TT"/>
+          <w:rtl w:val="0"/>
+        </w:rPr>
+        <w:t xml:space="preserve"> With task loss computed on the hard-snapped message and gradients passed through the snap as identity, heldout accuracy is 0.000 in all 3 seeds with the countermeasure removed. The vectors still encode the document (a retrained probe reads 0.93–0.98 of digits) but sit far from the vocabulary (cos 0.14–0.17), where the detector flags them; what collapses is the receiver-usable channel — a bound on this training setup, not on the attacker in general.</w:t>
       </w:r>
     </w:p>
     <w:p>
@@ -15112,7 +15457,7 @@
           <w:rtl w:val="0"/>
           <w:sz w:val="18"/>
         </w:rPr>
-        <w:t xml:space="preserve"> Adaptive channels (E1a checkpoints, 1,500 fine-tuning steps each; 3 seeds for evade λ = 10, mimic λ = 1 and snap-through, 1 seed otherwise; ranges are min–max over seeds). "Channel" is heldout exact match with no countermeasure; "probe" the frozen deployed monitor's digit accuracy (chance 0.1); "retrain" the probe retrained on 2,000 pairs from the adapted channel; "snap" exact match after full snapping; "cos" mean cosine similarity to the nearest token embedding (text is 1.0). Pre-adaptation values across the 3 checkpoints: channel 0.916–0.966, probe 0.871–0.885, snap 0.000, cos 0.727–0.740.</w:t>
+        <w:t xml:space="preserve"> Adaptive channels (E1a checkpoints, 1,500 fine-tuning steps each; 3 seeds for evade λ = 10, mimic λ = 1 and snap-through, 1 seed otherwise; min–max over seeds). "Channel": heldout exact match, no countermeasure; "probe": frozen deployed monitor's digit accuracy (chance 0.1); "retrain": probe retrained on 2,000 pairs from the adapted channel; "snap": exact match after full snapping; "cos": mean cosine to the nearest token embedding (text 1.0). Pre-adaptation, 3 checkpoints: channel 0.916–0.966, probe 0.871–0.885, snap 0.000, cos 0.727–0.740. Summarised in Table AD2.</w:t>
       </w:r>
     </w:p>
     <w:tbl>

</xml_diff>

<commit_message>
Full number-audit fixes: condition count, bit range, mimic-vs-detector claim
- 10 x 20 conditions (not 21; GRID has 19 + none)
- bit range 53-425 (32-pair docs carry 425.2 bits, not 213)
- mimic does not clear the 0.95 detector (cos 0.90-0.93): intro line,
  Table AD2 cell and lambda-3 cost wording corrected
- 6 of 7 runs at 0.002 or below (exact bound 0.00125)
- probe readout on mimic lambda-1: 0.64-0.67
- projection-kills-text qualified to Qwen and SmolLM2 (OLMo not run)

Co-Authored-By: Claude Code <noreply@anthropic.com>
</commit_message>
<xml_diff>
--- a/sprint/paper/submission.docx
+++ b/sprint/paper/submission.docx
@@ -1182,7 +1182,7 @@
           <w:rFonts w:ascii="Old Standard TT" w:cs="Old Standard TT" w:eastAsia="Old Standard TT" w:hAnsi="Old Standard TT"/>
           <w:rtl w:val="0"/>
         </w:rPr>
-        <w:t>• Two-bit quantisation removes every channel but also cuts OLMo's text from 0.506 to 0.164, and projection onto 256 token-embedding directions removes text as well (0.000), so neither is selective. Truncating to 8 vectors leaves pair-only channels above text (0.338 against 0.154), so a length cap is not a defence.</w:t>
+        <w:t>• Two-bit quantisation removes every channel but also cuts OLMo's text from 0.506 to 0.164, and projection onto 256 token-embedding directions removes text as well (0.000 for Qwen and SmolLM2), so neither is selective. Truncating to 8 vectors leaves pair-only channels above text (0.338 against 0.154), so a length cap is not a defence.</w:t>
       </w:r>
     </w:p>
     <w:p>
@@ -1241,7 +1241,7 @@
           <w:rFonts w:ascii="Old Standard TT" w:cs="Old Standard TT" w:eastAsia="Old Standard TT" w:hAnsi="Old Standard TT"/>
           <w:rtl w:val="0"/>
         </w:rPr>
-        <w:t>Each evasion beats the defence it targets, and each then fails against a defence it did not target. Table AD2 shows the corner; per-run detail is in Table AD1 (Appendix G).</w:t>
+        <w:t>Each evasion targets one defence, and none escapes the layer it did not target. Table AD2 shows the corner; per-run detail is in Table AD1 (Appendix G).</w:t>
       </w:r>
     </w:p>
     <w:p>
@@ -1274,19 +1274,19 @@
           <w:insideH w:val="single" w:sz="4" w:color="999999"/>
           <w:insideV w:val="single" w:sz="4" w:color="999999"/>
         </w:tblBorders>
-        <w:tblW w:w="9354" w:type="dxa"/>
+        <w:tblW w:w="9353" w:type="dxa"/>
         <w:tblLayout w:type="fixed"/>
       </w:tblPr>
       <w:tblGrid>
-        <w:gridCol w:w="2597"/>
-        <w:gridCol w:w="1449"/>
-        <w:gridCol w:w="3732"/>
-        <w:gridCol w:w="1576"/>
+        <w:gridCol w:w="2361"/>
+        <w:gridCol w:w="2167"/>
+        <w:gridCol w:w="3393"/>
+        <w:gridCol w:w="1432"/>
       </w:tblGrid>
       <w:tr>
         <w:tc>
           <w:tcPr>
-            <w:tcW w:type="dxa" w:w="2597"/>
+            <w:tcW w:type="dxa" w:w="2361"/>
           </w:tcPr>
           <w:p>
             <w:pPr>
@@ -1305,7 +1305,7 @@
         </w:tc>
         <w:tc>
           <w:tcPr>
-            <w:tcW w:type="dxa" w:w="1449"/>
+            <w:tcW w:type="dxa" w:w="2167"/>
           </w:tcPr>
           <w:p>
             <w:pPr>
@@ -1324,7 +1324,7 @@
         </w:tc>
         <w:tc>
           <w:tcPr>
-            <w:tcW w:type="dxa" w:w="3732"/>
+            <w:tcW w:type="dxa" w:w="3393"/>
           </w:tcPr>
           <w:p>
             <w:pPr>
@@ -1343,7 +1343,7 @@
         </w:tc>
         <w:tc>
           <w:tcPr>
-            <w:tcW w:type="dxa" w:w="1576"/>
+            <w:tcW w:type="dxa" w:w="1432"/>
           </w:tcPr>
           <w:p>
             <w:pPr>
@@ -1364,7 +1364,7 @@
       <w:tr>
         <w:tc>
           <w:tcPr>
-            <w:tcW w:type="dxa" w:w="2597"/>
+            <w:tcW w:type="dxa" w:w="2361"/>
           </w:tcPr>
           <w:p>
             <w:pPr>
@@ -1382,7 +1382,7 @@
         </w:tc>
         <w:tc>
           <w:tcPr>
-            <w:tcW w:type="dxa" w:w="1449"/>
+            <w:tcW w:type="dxa" w:w="2167"/>
           </w:tcPr>
           <w:p>
             <w:pPr>
@@ -1400,7 +1400,7 @@
         </w:tc>
         <w:tc>
           <w:tcPr>
-            <w:tcW w:type="dxa" w:w="3732"/>
+            <w:tcW w:type="dxa" w:w="3393"/>
           </w:tcPr>
           <w:p>
             <w:pPr>
@@ -1418,7 +1418,7 @@
         </w:tc>
         <w:tc>
           <w:tcPr>
-            <w:tcW w:type="dxa" w:w="1576"/>
+            <w:tcW w:type="dxa" w:w="1432"/>
           </w:tcPr>
           <w:p>
             <w:pPr>
@@ -1438,7 +1438,7 @@
       <w:tr>
         <w:tc>
           <w:tcPr>
-            <w:tcW w:type="dxa" w:w="2597"/>
+            <w:tcW w:type="dxa" w:w="2361"/>
           </w:tcPr>
           <w:p>
             <w:pPr>
@@ -1456,25 +1456,25 @@
         </w:tc>
         <w:tc>
           <w:tcPr>
-            <w:tcW w:type="dxa" w:w="1449"/>
-          </w:tcPr>
-          <w:p>
-            <w:pPr>
-              <w:spacing w:after="0"/>
-            </w:pPr>
-            <w:r>
-              <w:rPr>
-                <w:rFonts w:ascii="Old Standard TT" w:cs="Old Standard TT" w:eastAsia="Old Standard TT" w:hAnsi="Old Standard TT"/>
-                <w:rtl w:val="0"/>
-                <w:sz w:val="16"/>
-              </w:rPr>
-              <w:t>cos → 0.90–0.91</w:t>
-            </w:r>
-          </w:p>
-        </w:tc>
-        <w:tc>
-          <w:tcPr>
-            <w:tcW w:type="dxa" w:w="3732"/>
+            <w:tcW w:type="dxa" w:w="2167"/>
+          </w:tcPr>
+          <w:p>
+            <w:pPr>
+              <w:spacing w:after="0"/>
+            </w:pPr>
+            <w:r>
+              <w:rPr>
+                <w:rFonts w:ascii="Old Standard TT" w:cs="Old Standard TT" w:eastAsia="Old Standard TT" w:hAnsi="Old Standard TT"/>
+                <w:rtl w:val="0"/>
+                <w:sz w:val="16"/>
+              </w:rPr>
+              <w:t>cos → 0.90–0.91, still below 0.95</w:t>
+            </w:r>
+          </w:p>
+        </w:tc>
+        <w:tc>
+          <w:tcPr>
+            <w:tcW w:type="dxa" w:w="3393"/>
           </w:tcPr>
           <w:p>
             <w:pPr>
@@ -1492,7 +1492,7 @@
         </w:tc>
         <w:tc>
           <w:tcPr>
-            <w:tcW w:type="dxa" w:w="1576"/>
+            <w:tcW w:type="dxa" w:w="1432"/>
           </w:tcPr>
           <w:p>
             <w:pPr>
@@ -1512,7 +1512,7 @@
       <w:tr>
         <w:tc>
           <w:tcPr>
-            <w:tcW w:type="dxa" w:w="2597"/>
+            <w:tcW w:type="dxa" w:w="2361"/>
           </w:tcPr>
           <w:p>
             <w:pPr>
@@ -1530,7 +1530,7 @@
         </w:tc>
         <w:tc>
           <w:tcPr>
-            <w:tcW w:type="dxa" w:w="1449"/>
+            <w:tcW w:type="dxa" w:w="2167"/>
           </w:tcPr>
           <w:p>
             <w:pPr>
@@ -1548,7 +1548,7 @@
         </w:tc>
         <w:tc>
           <w:tcPr>
-            <w:tcW w:type="dxa" w:w="3732"/>
+            <w:tcW w:type="dxa" w:w="3393"/>
           </w:tcPr>
           <w:p>
             <w:pPr>
@@ -1566,7 +1566,7 @@
         </w:tc>
         <w:tc>
           <w:tcPr>
-            <w:tcW w:type="dxa" w:w="1576"/>
+            <w:tcW w:type="dxa" w:w="1432"/>
           </w:tcPr>
           <w:p>
             <w:pPr>
@@ -1620,7 +1620,7 @@
           <w:rFonts w:ascii="Old Standard TT" w:cs="Old Standard TT" w:eastAsia="Old Standard TT" w:hAnsi="Old Standard TT"/>
           <w:rtl w:val="0"/>
         </w:rPr>
-        <w:t xml:space="preserve"> — a token string that is not the encoding the receiver was trained on, so full snapping drops every mimic run to 0.000; the probe also still reads 0.60–0.67 of its digits (λ = 3 reaches cos 0.931 for 4 points, 0.933).</w:t>
+        <w:t xml:space="preserve"> — a token string that is not the encoding the receiver was trained on, so full snapping drops every mimic run to 0.000; the probe also still reads 0.64–0.67 of its digits (λ = 3 reaches cos 0.931 for 3 points, 0.933).</w:t>
       </w:r>
     </w:p>
     <w:p>
@@ -1696,7 +1696,7 @@
           <w:rFonts w:ascii="Old Standard TT" w:cs="Old Standard TT" w:eastAsia="Old Standard TT" w:hAnsi="Old Standard TT"/>
           <w:rtl w:val="0"/>
         </w:rPr>
-        <w:t>At 3.1× compression the channel reaches 0.818 to 0.975 at every length, against 0.401 to 0.461 for text, so the vectors needed grow with the message and the advantage stays about twofold. At 6.2× the recipe breaks from 8 pairs on: 6 of 7 runs end at 0.001 or below. The outcome is set early (step-500 accuracy predicts it, AUROC 0.986, Appendix F), and a curriculum starting with four times as many vectors and halving twice rescued the three retried failed seeds above text (0.300 to 0.513 against 0.200 to 0.205; three other failed seeds were not retried; Appendix E).</w:t>
+        <w:t>At 3.1× compression the channel reaches 0.818 to 0.975 at every length, against 0.401 to 0.461 for text, so the vectors needed grow with the message and the advantage stays about twofold. At 6.2× the recipe breaks from 8 pairs on: 6 of 7 runs end at 0.002 or below. The outcome is set early (step-500 accuracy predicts it, AUROC 0.986, Appendix F), and a curriculum starting with four times as many vectors and halving twice rescued the three retried failed seeds above text (0.300 to 0.513 against 0.200 to 0.205; three other failed seeds were not retried; Appendix E).</w:t>
       </w:r>
     </w:p>
     <w:p>
@@ -2307,7 +2307,7 @@
           <w:rFonts w:ascii="Old Standard TT" w:cs="Old Standard TT" w:eastAsia="Old Standard TT" w:hAnsi="Old Standard TT"/>
           <w:rtl w:val="0"/>
         </w:rPr>
-        <w:t xml:space="preserve"> All models are under 1.5B parameters, and the task is key-value recall with 53 to 213 bits per document. Results may not transfer to larger models or natural documents.</w:t>
+        <w:t xml:space="preserve"> All models are under 1.5B parameters, and the task is key-value recall with 53 to 425 bits per document. Results may not transfer to larger models or natural documents.</w:t>
       </w:r>
     </w:p>
     <w:p>
@@ -2760,7 +2760,7 @@
                 <w:rtl w:val="0"/>
                 <w:sz w:val="16"/>
               </w:rPr>
-              <w:t>10 checkpoints × 21 conditions; text control 2 receivers × 3 noise seeds</w:t>
+              <w:t>10 checkpoints × 20 conditions; text control 2 receivers × 3 noise seeds</w:t>
             </w:r>
           </w:p>
         </w:tc>

</xml_diff>

<commit_message>
A7 with a stronger relaxation: Gumbel-softmax snap-through also collapses (3/3)
- adaptive.py: new gumbel mode (softmax over the vocabulary, tau);
  3 seeds recorded in adaptive.json — channel 0.000 in every run,
  same collapse as the identity straight-through estimator
- paper: 4.3 sentence, Table AD2 (6/6), Table AD1 row, Appendix A/B wording
- README: gumbel mode in the usage line

Co-Authored-By: Claude Code <noreply@anthropic.com>
</commit_message>
<xml_diff>
--- a/sprint/paper/submission.docx
+++ b/sprint/paper/submission.docx
@@ -1560,7 +1560,7 @@
                 <w:rtl w:val="0"/>
                 <w:sz w:val="16"/>
               </w:rPr>
-              <w:t>collapse: 0.000 in 3/3 with snap removed</w:t>
+              <w:t>collapse: 0.000 in 6/6 seeds (identity STE and Gumbel-softmax)</w:t>
             </w:r>
           </w:p>
         </w:tc>
@@ -1637,7 +1637,7 @@
           <w:rFonts w:ascii="Old Standard TT" w:cs="Old Standard TT" w:eastAsia="Old Standard TT" w:hAnsi="Old Standard TT"/>
           <w:rtl w:val="0"/>
         </w:rPr>
-        <w:t xml:space="preserve"> With task loss computed on the hard-snapped message and gradients passed through the snap as identity, heldout accuracy is 0.000 in all 3 seeds with the countermeasure removed. The vectors still encode the document (a retrained probe reads 0.93–0.98 of digits) but sit far from the vocabulary (cos 0.14–0.17), where the detector flags them; what collapses is the receiver-usable channel — a bound on this training setup, not on the attacker in general.</w:t>
+        <w:t xml:space="preserve"> With task loss computed on the hard-snapped message and gradients passed through the snap as identity, heldout accuracy is 0.000 in all 3 seeds with the countermeasure removed. A stronger relaxation does not change this: a Gumbel-softmax over the vocabulary (τ = 0.5), whose gradients flow through the token choice itself, also ends at 0.000 in all 3 seeds. The vectors still encode the document (a retrained probe reads 0.93–0.98 of digits) but sit far from the vocabulary (cos 0.14–0.17), where the detector flags them; what collapses is the receiver-usable channel — a bound on this training setup, not on the attacker in general.</w:t>
       </w:r>
     </w:p>
     <w:p>
@@ -2199,7 +2199,7 @@
           <w:rFonts w:ascii="Old Standard TT" w:cs="Old Standard TT" w:eastAsia="Old Standard TT" w:hAnsi="Old Standard TT"/>
           <w:rtl w:val="0"/>
         </w:rPr>
-        <w:t xml:space="preserve"> For learned vector channels between small frozen LLMs trained without any adversarial objective, canonicalising messages onto the receiver's vocabulary removes the channel's advantage, and a supervised probe can recover much of the message content. For channels fine-tuned against the deployed monitor or against nearest-token detection, each single evasion succeeds against its target but leaves the message exposed to the other defence layer; a channel trained through the hard snap with a straight-through estimator collapses rather than surviving. It does not establish that canonicalisation stops every adaptive channel, that real multi-agent systems would form such channels, or that results hold for large models. The main limitations are listed in Section 5.</w:t>
+        <w:t xml:space="preserve"> For learned vector channels between small frozen LLMs trained without any adversarial objective, canonicalising messages onto the receiver's vocabulary removes the channel's advantage, and a supervised probe can recover much of the message content. For channels fine-tuned against the deployed monitor or against nearest-token detection, each single evasion succeeds against its target but leaves the message exposed to the other defence layer; a channel trained through the hard snap — by identity straight-through estimator or by Gumbel-softmax relaxation — collapses rather than surviving. It does not establish that canonicalisation stops every adaptive channel, that real multi-agent systems would form such channels, or that results hold for large models. The main limitations are listed in Section 5.</w:t>
       </w:r>
     </w:p>
     <w:p>
@@ -2253,7 +2253,7 @@
           <w:rFonts w:ascii="Old Standard TT" w:cs="Old Standard TT" w:eastAsia="Old Standard TT" w:hAnsi="Old Standard TT"/>
           <w:rtl w:val="0"/>
         </w:rPr>
-        <w:t xml:space="preserve"> The 49 channels of Sections 4.1–4.2 were trained with no countermeasure in the loop and no incentive to hide anything. The adaptive runs of Section 4.3 fine-tune a few checkpoints for 1,500 steps, each against exactly one defence — a frozen linear probe, nearest-token distance, or the hard snap through a straight-through relaxation — so they bound what a first-order evasion achieves, not what a channel trained against the full stack at once, or with a differentiable relaxation better matched to the argmax snap, would do; Westphal et al. (2026) report fine-tuned models evading linear and MLP probes more broadly. Our countermeasure and monitor results are lower bounds on difficulty for the defender, not guarantees.</w:t>
+        <w:t xml:space="preserve"> The 49 channels of Sections 4.1–4.2 were trained with no countermeasure in the loop and no incentive to hide anything. The adaptive runs of Section 4.3 fine-tune a few checkpoints for 1,500 steps, each against exactly one defence — a frozen linear probe, nearest-token distance, or the hard snap (identity or Gumbel-softmax relaxation) — so they bound what a first-order evasion achieves, not what a channel trained against the full stack at once, or with stronger optimisation for the discrete snap, would do; Westphal et al. (2026) report fine-tuned models evading linear and MLP probes more broadly. Our countermeasure and monitor results are lower bounds on difficulty for the defender, not guarantees.</w:t>
       </w:r>
     </w:p>
     <w:p>
@@ -2888,7 +2888,7 @@
                 <w:rtl w:val="0"/>
                 <w:sz w:val="16"/>
               </w:rPr>
-              <w:t>E1a checkpoints fine-tuned under evasion objectives (probe-evade λ = 10, 1, 3; token-mimic λ = 1, 3; snap-through with a straight-through estimator), 1,500 steps each, 1–3 seeds, on the Mac (MPS, $0)</w:t>
+              <w:t>E1a checkpoints fine-tuned under evasion objectives (probe-evade λ = 10, 1, 3; token-mimic λ = 1, 3; snap-through with a straight-through estimator and with Gumbel-softmax, 3 seeds each), 1,500 steps each, 1–3 seeds, on the Mac (MPS, $0)</w:t>
             </w:r>
           </w:p>
         </w:tc>
@@ -15475,17 +15475,17 @@
         <w:tblLayout w:type="fixed"/>
       </w:tblPr>
       <w:tblGrid>
-        <w:gridCol w:w="2823"/>
-        <w:gridCol w:w="1364"/>
-        <w:gridCol w:w="1364"/>
-        <w:gridCol w:w="1364"/>
-        <w:gridCol w:w="1074"/>
-        <w:gridCol w:w="1364"/>
+        <w:gridCol w:w="3474"/>
+        <w:gridCol w:w="1228"/>
+        <w:gridCol w:w="1228"/>
+        <w:gridCol w:w="1228"/>
+        <w:gridCol w:w="967"/>
+        <w:gridCol w:w="1228"/>
       </w:tblGrid>
       <w:tr>
         <w:tc>
           <w:tcPr>
-            <w:tcW w:type="dxa" w:w="2823"/>
+            <w:tcW w:type="dxa" w:w="3474"/>
           </w:tcPr>
           <w:p>
             <w:pPr>
@@ -15504,7 +15504,7 @@
         </w:tc>
         <w:tc>
           <w:tcPr>
-            <w:tcW w:type="dxa" w:w="1364"/>
+            <w:tcW w:type="dxa" w:w="1228"/>
           </w:tcPr>
           <w:p>
             <w:pPr>
@@ -15523,7 +15523,7 @@
         </w:tc>
         <w:tc>
           <w:tcPr>
-            <w:tcW w:type="dxa" w:w="1364"/>
+            <w:tcW w:type="dxa" w:w="1228"/>
           </w:tcPr>
           <w:p>
             <w:pPr>
@@ -15542,7 +15542,7 @@
         </w:tc>
         <w:tc>
           <w:tcPr>
-            <w:tcW w:type="dxa" w:w="1364"/>
+            <w:tcW w:type="dxa" w:w="1228"/>
           </w:tcPr>
           <w:p>
             <w:pPr>
@@ -15561,7 +15561,7 @@
         </w:tc>
         <w:tc>
           <w:tcPr>
-            <w:tcW w:type="dxa" w:w="1074"/>
+            <w:tcW w:type="dxa" w:w="967"/>
           </w:tcPr>
           <w:p>
             <w:pPr>
@@ -15580,7 +15580,7 @@
         </w:tc>
         <w:tc>
           <w:tcPr>
-            <w:tcW w:type="dxa" w:w="1364"/>
+            <w:tcW w:type="dxa" w:w="1228"/>
           </w:tcPr>
           <w:p>
             <w:pPr>
@@ -15601,7 +15601,7 @@
       <w:tr>
         <w:tc>
           <w:tcPr>
-            <w:tcW w:type="dxa" w:w="2823"/>
+            <w:tcW w:type="dxa" w:w="3474"/>
           </w:tcPr>
           <w:p>
             <w:pPr>
@@ -15619,7 +15619,7 @@
         </w:tc>
         <w:tc>
           <w:tcPr>
-            <w:tcW w:type="dxa" w:w="1364"/>
+            <w:tcW w:type="dxa" w:w="1228"/>
           </w:tcPr>
           <w:p>
             <w:pPr>
@@ -15637,7 +15637,7 @@
         </w:tc>
         <w:tc>
           <w:tcPr>
-            <w:tcW w:type="dxa" w:w="1364"/>
+            <w:tcW w:type="dxa" w:w="1228"/>
           </w:tcPr>
           <w:p>
             <w:pPr>
@@ -15655,7 +15655,7 @@
         </w:tc>
         <w:tc>
           <w:tcPr>
-            <w:tcW w:type="dxa" w:w="1364"/>
+            <w:tcW w:type="dxa" w:w="1228"/>
           </w:tcPr>
           <w:p>
             <w:pPr>
@@ -15673,7 +15673,7 @@
         </w:tc>
         <w:tc>
           <w:tcPr>
-            <w:tcW w:type="dxa" w:w="1074"/>
+            <w:tcW w:type="dxa" w:w="967"/>
           </w:tcPr>
           <w:p>
             <w:pPr>
@@ -15691,7 +15691,7 @@
         </w:tc>
         <w:tc>
           <w:tcPr>
-            <w:tcW w:type="dxa" w:w="1364"/>
+            <w:tcW w:type="dxa" w:w="1228"/>
           </w:tcPr>
           <w:p>
             <w:pPr>
@@ -15711,7 +15711,7 @@
       <w:tr>
         <w:tc>
           <w:tcPr>
-            <w:tcW w:type="dxa" w:w="2823"/>
+            <w:tcW w:type="dxa" w:w="3474"/>
           </w:tcPr>
           <w:p>
             <w:pPr>
@@ -15729,7 +15729,7 @@
         </w:tc>
         <w:tc>
           <w:tcPr>
-            <w:tcW w:type="dxa" w:w="1364"/>
+            <w:tcW w:type="dxa" w:w="1228"/>
           </w:tcPr>
           <w:p>
             <w:pPr>
@@ -15747,7 +15747,7 @@
         </w:tc>
         <w:tc>
           <w:tcPr>
-            <w:tcW w:type="dxa" w:w="1364"/>
+            <w:tcW w:type="dxa" w:w="1228"/>
           </w:tcPr>
           <w:p>
             <w:pPr>
@@ -15765,7 +15765,7 @@
         </w:tc>
         <w:tc>
           <w:tcPr>
-            <w:tcW w:type="dxa" w:w="1364"/>
+            <w:tcW w:type="dxa" w:w="1228"/>
           </w:tcPr>
           <w:p>
             <w:pPr>
@@ -15783,7 +15783,7 @@
         </w:tc>
         <w:tc>
           <w:tcPr>
-            <w:tcW w:type="dxa" w:w="1074"/>
+            <w:tcW w:type="dxa" w:w="967"/>
           </w:tcPr>
           <w:p>
             <w:pPr>
@@ -15801,7 +15801,7 @@
         </w:tc>
         <w:tc>
           <w:tcPr>
-            <w:tcW w:type="dxa" w:w="1364"/>
+            <w:tcW w:type="dxa" w:w="1228"/>
           </w:tcPr>
           <w:p>
             <w:pPr>
@@ -15821,7 +15821,7 @@
       <w:tr>
         <w:tc>
           <w:tcPr>
-            <w:tcW w:type="dxa" w:w="2823"/>
+            <w:tcW w:type="dxa" w:w="3474"/>
           </w:tcPr>
           <w:p>
             <w:pPr>
@@ -15839,7 +15839,7 @@
         </w:tc>
         <w:tc>
           <w:tcPr>
-            <w:tcW w:type="dxa" w:w="1364"/>
+            <w:tcW w:type="dxa" w:w="1228"/>
           </w:tcPr>
           <w:p>
             <w:pPr>
@@ -15857,7 +15857,7 @@
         </w:tc>
         <w:tc>
           <w:tcPr>
-            <w:tcW w:type="dxa" w:w="1364"/>
+            <w:tcW w:type="dxa" w:w="1228"/>
           </w:tcPr>
           <w:p>
             <w:pPr>
@@ -15875,7 +15875,7 @@
         </w:tc>
         <w:tc>
           <w:tcPr>
-            <w:tcW w:type="dxa" w:w="1364"/>
+            <w:tcW w:type="dxa" w:w="1228"/>
           </w:tcPr>
           <w:p>
             <w:pPr>
@@ -15893,7 +15893,7 @@
         </w:tc>
         <w:tc>
           <w:tcPr>
-            <w:tcW w:type="dxa" w:w="1074"/>
+            <w:tcW w:type="dxa" w:w="967"/>
           </w:tcPr>
           <w:p>
             <w:pPr>
@@ -15911,7 +15911,7 @@
         </w:tc>
         <w:tc>
           <w:tcPr>
-            <w:tcW w:type="dxa" w:w="1364"/>
+            <w:tcW w:type="dxa" w:w="1228"/>
           </w:tcPr>
           <w:p>
             <w:pPr>
@@ -15931,7 +15931,7 @@
       <w:tr>
         <w:tc>
           <w:tcPr>
-            <w:tcW w:type="dxa" w:w="2823"/>
+            <w:tcW w:type="dxa" w:w="3474"/>
           </w:tcPr>
           <w:p>
             <w:pPr>
@@ -15949,7 +15949,7 @@
         </w:tc>
         <w:tc>
           <w:tcPr>
-            <w:tcW w:type="dxa" w:w="1364"/>
+            <w:tcW w:type="dxa" w:w="1228"/>
           </w:tcPr>
           <w:p>
             <w:pPr>
@@ -15967,7 +15967,7 @@
         </w:tc>
         <w:tc>
           <w:tcPr>
-            <w:tcW w:type="dxa" w:w="1364"/>
+            <w:tcW w:type="dxa" w:w="1228"/>
           </w:tcPr>
           <w:p>
             <w:pPr>
@@ -15985,7 +15985,7 @@
         </w:tc>
         <w:tc>
           <w:tcPr>
-            <w:tcW w:type="dxa" w:w="1364"/>
+            <w:tcW w:type="dxa" w:w="1228"/>
           </w:tcPr>
           <w:p>
             <w:pPr>
@@ -16003,7 +16003,7 @@
         </w:tc>
         <w:tc>
           <w:tcPr>
-            <w:tcW w:type="dxa" w:w="1074"/>
+            <w:tcW w:type="dxa" w:w="967"/>
           </w:tcPr>
           <w:p>
             <w:pPr>
@@ -16021,7 +16021,7 @@
         </w:tc>
         <w:tc>
           <w:tcPr>
-            <w:tcW w:type="dxa" w:w="1364"/>
+            <w:tcW w:type="dxa" w:w="1228"/>
           </w:tcPr>
           <w:p>
             <w:pPr>
@@ -16041,7 +16041,7 @@
       <w:tr>
         <w:tc>
           <w:tcPr>
-            <w:tcW w:type="dxa" w:w="2823"/>
+            <w:tcW w:type="dxa" w:w="3474"/>
           </w:tcPr>
           <w:p>
             <w:pPr>
@@ -16059,7 +16059,7 @@
         </w:tc>
         <w:tc>
           <w:tcPr>
-            <w:tcW w:type="dxa" w:w="1364"/>
+            <w:tcW w:type="dxa" w:w="1228"/>
           </w:tcPr>
           <w:p>
             <w:pPr>
@@ -16077,7 +16077,7 @@
         </w:tc>
         <w:tc>
           <w:tcPr>
-            <w:tcW w:type="dxa" w:w="1364"/>
+            <w:tcW w:type="dxa" w:w="1228"/>
           </w:tcPr>
           <w:p>
             <w:pPr>
@@ -16095,7 +16095,7 @@
         </w:tc>
         <w:tc>
           <w:tcPr>
-            <w:tcW w:type="dxa" w:w="1364"/>
+            <w:tcW w:type="dxa" w:w="1228"/>
           </w:tcPr>
           <w:p>
             <w:pPr>
@@ -16113,7 +16113,7 @@
         </w:tc>
         <w:tc>
           <w:tcPr>
-            <w:tcW w:type="dxa" w:w="1074"/>
+            <w:tcW w:type="dxa" w:w="967"/>
           </w:tcPr>
           <w:p>
             <w:pPr>
@@ -16131,7 +16131,7 @@
         </w:tc>
         <w:tc>
           <w:tcPr>
-            <w:tcW w:type="dxa" w:w="1364"/>
+            <w:tcW w:type="dxa" w:w="1228"/>
           </w:tcPr>
           <w:p>
             <w:pPr>
@@ -16151,7 +16151,7 @@
       <w:tr>
         <w:tc>
           <w:tcPr>
-            <w:tcW w:type="dxa" w:w="2823"/>
+            <w:tcW w:type="dxa" w:w="3474"/>
           </w:tcPr>
           <w:p>
             <w:pPr>
@@ -16169,7 +16169,7 @@
         </w:tc>
         <w:tc>
           <w:tcPr>
-            <w:tcW w:type="dxa" w:w="1364"/>
+            <w:tcW w:type="dxa" w:w="1228"/>
           </w:tcPr>
           <w:p>
             <w:pPr>
@@ -16187,7 +16187,7 @@
         </w:tc>
         <w:tc>
           <w:tcPr>
-            <w:tcW w:type="dxa" w:w="1364"/>
+            <w:tcW w:type="dxa" w:w="1228"/>
           </w:tcPr>
           <w:p>
             <w:pPr>
@@ -16205,7 +16205,7 @@
         </w:tc>
         <w:tc>
           <w:tcPr>
-            <w:tcW w:type="dxa" w:w="1364"/>
+            <w:tcW w:type="dxa" w:w="1228"/>
           </w:tcPr>
           <w:p>
             <w:pPr>
@@ -16223,7 +16223,7 @@
         </w:tc>
         <w:tc>
           <w:tcPr>
-            <w:tcW w:type="dxa" w:w="1074"/>
+            <w:tcW w:type="dxa" w:w="967"/>
           </w:tcPr>
           <w:p>
             <w:pPr>
@@ -16241,7 +16241,7 @@
         </w:tc>
         <w:tc>
           <w:tcPr>
-            <w:tcW w:type="dxa" w:w="1364"/>
+            <w:tcW w:type="dxa" w:w="1228"/>
           </w:tcPr>
           <w:p>
             <w:pPr>
@@ -16254,6 +16254,116 @@
                 <w:sz w:val="16"/>
               </w:rPr>
               <w:t>0.138–0.170</w:t>
+            </w:r>
+          </w:p>
+        </w:tc>
+      </w:tr>
+      <w:tr>
+        <w:tc>
+          <w:tcPr>
+            <w:tcW w:type="dxa" w:w="3474"/>
+          </w:tcPr>
+          <w:p>
+            <w:pPr>
+              <w:spacing w:after="0"/>
+            </w:pPr>
+            <w:r>
+              <w:rPr>
+                <w:rFonts w:ascii="Old Standard TT" w:cs="Old Standard TT" w:eastAsia="Old Standard TT" w:hAnsi="Old Standard TT"/>
+                <w:rtl w:val="0"/>
+                <w:sz w:val="16"/>
+              </w:rPr>
+              <w:t>Train through snap, Gumbel τ = 0.5 (3 seeds)</w:t>
+            </w:r>
+          </w:p>
+        </w:tc>
+        <w:tc>
+          <w:tcPr>
+            <w:tcW w:type="dxa" w:w="1228"/>
+          </w:tcPr>
+          <w:p>
+            <w:pPr>
+              <w:spacing w:after="0"/>
+            </w:pPr>
+            <w:r>
+              <w:rPr>
+                <w:rFonts w:ascii="Old Standard TT" w:cs="Old Standard TT" w:eastAsia="Old Standard TT" w:hAnsi="Old Standard TT"/>
+                <w:rtl w:val="0"/>
+                <w:sz w:val="16"/>
+              </w:rPr>
+              <w:t>0.000</w:t>
+            </w:r>
+          </w:p>
+        </w:tc>
+        <w:tc>
+          <w:tcPr>
+            <w:tcW w:type="dxa" w:w="1228"/>
+          </w:tcPr>
+          <w:p>
+            <w:pPr>
+              <w:spacing w:after="0"/>
+            </w:pPr>
+            <w:r>
+              <w:rPr>
+                <w:rFonts w:ascii="Old Standard TT" w:cs="Old Standard TT" w:eastAsia="Old Standard TT" w:hAnsi="Old Standard TT"/>
+                <w:rtl w:val="0"/>
+                <w:sz w:val="16"/>
+              </w:rPr>
+              <w:t>0.099–0.118</w:t>
+            </w:r>
+          </w:p>
+        </w:tc>
+        <w:tc>
+          <w:tcPr>
+            <w:tcW w:type="dxa" w:w="1228"/>
+          </w:tcPr>
+          <w:p>
+            <w:pPr>
+              <w:spacing w:after="0"/>
+            </w:pPr>
+            <w:r>
+              <w:rPr>
+                <w:rFonts w:ascii="Old Standard TT" w:cs="Old Standard TT" w:eastAsia="Old Standard TT" w:hAnsi="Old Standard TT"/>
+                <w:rtl w:val="0"/>
+                <w:sz w:val="16"/>
+              </w:rPr>
+              <w:t>0.945–0.972</w:t>
+            </w:r>
+          </w:p>
+        </w:tc>
+        <w:tc>
+          <w:tcPr>
+            <w:tcW w:type="dxa" w:w="967"/>
+          </w:tcPr>
+          <w:p>
+            <w:pPr>
+              <w:spacing w:after="0"/>
+            </w:pPr>
+            <w:r>
+              <w:rPr>
+                <w:rFonts w:ascii="Old Standard TT" w:cs="Old Standard TT" w:eastAsia="Old Standard TT" w:hAnsi="Old Standard TT"/>
+                <w:rtl w:val="0"/>
+                <w:sz w:val="16"/>
+              </w:rPr>
+              <w:t>0.000</w:t>
+            </w:r>
+          </w:p>
+        </w:tc>
+        <w:tc>
+          <w:tcPr>
+            <w:tcW w:type="dxa" w:w="1228"/>
+          </w:tcPr>
+          <w:p>
+            <w:pPr>
+              <w:spacing w:after="0"/>
+            </w:pPr>
+            <w:r>
+              <w:rPr>
+                <w:rFonts w:ascii="Old Standard TT" w:cs="Old Standard TT" w:eastAsia="Old Standard TT" w:hAnsi="Old Standard TT"/>
+                <w:rtl w:val="0"/>
+                <w:sz w:val="16"/>
+              </w:rPr>
+              <w:t>0.703–0.817</w:t>
             </w:r>
           </w:p>
         </w:tc>

</xml_diff>

<commit_message>
Figure 1 now carries the cornering story (bottom strip)
- fig_overview: compact strip under the setup diagram — each adaptive
  evasion and the defence that catches it (Section 4.3, Table AD2 numbers)
- caption updated; body still ends on page 8

Co-Authored-By: Claude Code <noreply@anthropic.com>
</commit_message>
<xml_diff>
--- a/sprint/paper/submission.docx
+++ b/sprint/paper/submission.docx
@@ -567,7 +567,7 @@
       <w:r>
         <w:drawing>
           <wp:inline>
-            <wp:extent cx="5940000" cy="2562897"/>
+            <wp:extent cx="5940000" cy="3303084"/>
             <wp:docPr id="1" name="Picture 1"/>
             <wp:cNvGraphicFramePr>
               <a:graphicFrameLocks noChangeAspect="1"/>
@@ -588,7 +588,7 @@
                   <pic:spPr>
                     <a:xfrm>
                       <a:off x="0" y="0"/>
-                      <a:ext cx="5940000" cy="2562897"/>
+                      <a:ext cx="5940000" cy="3303084"/>
                     </a:xfrm>
                     <a:prstGeom prst="rect"/>
                   </pic:spPr>
@@ -615,7 +615,7 @@
           <w:rtl w:val="0"/>
           <w:sz w:val="18"/>
         </w:rPr>
-        <w:t xml:space="preserve"> Setup. Only the sender sees the document. Vector path (blue): a trained adapter turns the sender's hidden states into 16 vectors that the frozen receiver reads in place of text. Text path: the same budget of 16 tokens in the best hand-designed format, which fits 2 of the 4 values. The defender controls the receiver's input; full snapping replaces each vector with its nearest token embedding and leaves text unchanged. The monitor reads the vectors without the receiver. Numbers: Qwen → Qwen, mean of 5 checkpoints; the document and nearest-token reading are from checkpoint 0.</w:t>
+        <w:t xml:space="preserve"> Setup. Only the sender sees the document. Vector path (blue): a trained adapter turns the sender's hidden states into 16 vectors that the frozen receiver reads in place of text. Text path: the same budget of 16 tokens in the best hand-designed format, which fits 2 of the 4 values. The defender controls the receiver's input; full snapping replaces each vector with its nearest token embedding and leaves text unchanged. The monitor reads the vectors without the receiver. Numbers: Qwen → Qwen, mean of 5 checkpoints; the document and nearest-token reading are from checkpoint 0. Bottom strip: each adaptive channel of Section 4.3 and the defence that catches it.</w:t>
       </w:r>
     </w:p>
     <w:p>

</xml_diff>

<commit_message>
Remove the Figure 1 cornering strip; restore original diagram
User judged the strip hurt readability (text overflow, unclear
purpose) — the diagram alone carries the setup, and Section 4.3
already tells the cornering story in Table AD2.

Co-Authored-By: Claude Code <noreply@anthropic.com>
</commit_message>
<xml_diff>
--- a/sprint/paper/submission.docx
+++ b/sprint/paper/submission.docx
@@ -567,7 +567,7 @@
       <w:r>
         <w:drawing>
           <wp:inline>
-            <wp:extent cx="5940000" cy="3303084"/>
+            <wp:extent cx="5940000" cy="3253738"/>
             <wp:docPr id="1" name="Picture 1"/>
             <wp:cNvGraphicFramePr>
               <a:graphicFrameLocks noChangeAspect="1"/>
@@ -588,7 +588,7 @@
                   <pic:spPr>
                     <a:xfrm>
                       <a:off x="0" y="0"/>
-                      <a:ext cx="5940000" cy="3303084"/>
+                      <a:ext cx="5940000" cy="3253738"/>
                     </a:xfrm>
                     <a:prstGeom prst="rect"/>
                   </pic:spPr>

</xml_diff>

<commit_message>
Update submission PDF/DOCX to final build (17pp, references from p.9)
Co-Authored-By: Claude Code <noreply@anthropic.com>
</commit_message>
<xml_diff>
--- a/sprint/paper/submission.docx
+++ b/sprint/paper/submission.docx
@@ -567,7 +567,7 @@
       <w:r>
         <w:drawing>
           <wp:inline>
-            <wp:extent cx="5940000" cy="3253738"/>
+            <wp:extent cx="5940000" cy="2562897"/>
             <wp:docPr id="1" name="Picture 1"/>
             <wp:cNvGraphicFramePr>
               <a:graphicFrameLocks noChangeAspect="1"/>
@@ -588,7 +588,7 @@
                   <pic:spPr>
                     <a:xfrm>
                       <a:off x="0" y="0"/>
-                      <a:ext cx="5940000" cy="3253738"/>
+                      <a:ext cx="5940000" cy="2562897"/>
                     </a:xfrm>
                     <a:prstGeom prst="rect"/>
                   </pic:spPr>
@@ -615,7 +615,7 @@
           <w:rtl w:val="0"/>
           <w:sz w:val="18"/>
         </w:rPr>
-        <w:t xml:space="preserve"> Setup. Only the sender sees the document. Vector path (blue): a trained adapter turns the sender's hidden states into 16 vectors that the frozen receiver reads in place of text. Text path: the same budget of 16 tokens in the best hand-designed format, which fits 2 of the 4 values. The defender controls the receiver's input; full snapping replaces each vector with its nearest token embedding and leaves text unchanged. The monitor reads the vectors without the receiver. Numbers: Qwen → Qwen, mean of 5 checkpoints; the document and nearest-token reading are from checkpoint 0. Bottom strip: each adaptive channel of Section 4.3 and the defence that catches it.</w:t>
+        <w:t xml:space="preserve"> Setup. Only the sender sees the document. Vector path (blue): a trained adapter turns the sender's hidden states into 16 vectors that the frozen receiver reads in place of text. Text path: the same budget of 16 tokens in the best hand-designed format, which fits 2 of the 4 values. The defender controls the receiver's input; full snapping replaces each vector with its nearest token embedding and leaves text unchanged. The monitor reads the vectors without the receiver. Numbers: Qwen → Qwen, mean of 5 checkpoints; the document and nearest-token reading are from checkpoint 0. Each adaptive evasion of Section 4.3 walks into a defence it did not target.</w:t>
       </w:r>
     </w:p>
     <w:p>

</xml_diff>